<commit_message>
Báo cáo Word tiến độ: dựng lại từ báo cáo tình trạng đã sửa
Co-Authored-By: Claude <noreply@anthropic.com>
Claude-Session: https://claude.ai/code/session_01W75mjctkB2SZty7ogWDMjM
</commit_message>
<xml_diff>
--- a/docs/Bao-cao-danh-gia-tien-do-May-VSTEP.docx
+++ b/docs/Bao-cao-danh-gia-tien-do-May-VSTEP.docx
@@ -290,6 +290,16 @@
           <w:sz w:val="20"/>
         </w:rPr>
         <w:t xml:space="preserve"> gửi cho dịch vụ AI nào, và file báo lỗi chỉ đếm số ghi chú chứ không chứa nội dung.</w:t>
+      </w:r>
+    </w:p>
+    <w:p>
+      <w:r>
+        <w:rPr>
+          <w:rFonts w:ascii="Arial" w:hAnsi="Arial" w:eastAsia="Arial"/>
+          <w:color w:val="211D20"/>
+          <w:sz w:val="20"/>
+        </w:rPr>
+        <w:t>Cùng ngày, giao diện máy tính được rà lại từng màn (chụp ở 1440×900 và 1280×720) và phần luyện thi được dựng lại cho giống phần mềm thi trên máy: khung cố định vừa màn hình, đề và câu hỏi cuộn riêng, bảng câu hỏi và nút Nháp ở thanh dưới, Nghe và Nói ở cột giữa, con trỏ hệ thống trong phòng thi. Đây là cách bố trí thường gặp ở phần mềm thi trên máy, không phải phần mềm VSTEP chính thức. Chưa có ai ngoài các ca kiểm thử tự động dùng thử; nên để Gùa làm thử một phần Đọc và một phần Viết rồi nói chỗ nào còn vướng. Chi tiết nằm ở đầu QUALITY.md.</w:t>
       </w:r>
     </w:p>
     <w:p>
@@ -1431,7 +1441,7 @@
                 <w:color w:val="211D20"/>
                 <w:sz w:val="16"/>
               </w:rPr>
-              <w:t>258/258</w:t>
+              <w:t>282/282</w:t>
             </w:r>
           </w:p>
         </w:tc>

</xml_diff>